<commit_message>
Add General Assembly Data Analytics Bootcamp (10/2025-05/2026) to CV, site, experience
</commit_message>
<xml_diff>
--- a/assets/Yusuf_Hakeem_Data_Analyst_CV_Bahrain.docx
+++ b/assets/Yusuf_Hakeem_Data_Analyst_CV_Bahrain.docx
@@ -79,7 +79,7 @@
           <w:sz w:val="21"/>
           <w:szCs w:val="21"/>
         </w:rPr>
-        <w:t xml:space="preserve">Bahrain-based Data Analyst combining 10+ years of structured operational reporting at G4S with hands-on technical training in SQL, Python, Excel, and BI tools (Power BI/Tableau). Proven track record of maintaining auditable records, summarizing daily activity into clear reports, and identifying recurring patterns — the core discipline behind KPI reporting and trend analysis. No visa sponsorship or relocation required; ready to contribute immediately to data cleaning, dashboard build-out, and insight generation.</w:t>
+        <w:t xml:space="preserve">Bahrain-based Data Analyst combining 10+ years of structured operational reporting at G4S with a completed part-time Data Analytics Bootcamp (General Assembly, 10/2025–05/2026) in SQL, Python, Excel, and BI tools (Power BI/Tableau). Proven track record of maintaining auditable records, summarizing daily activity into clear reports, and identifying recurring patterns — the core discipline behind KPI reporting and trend analysis. No visa sponsorship or relocation required; ready to contribute immediately to data cleaning, dashboard build-out, and insight generation.</w:t>
       </w:r>
     </w:p>
     <w:p>
@@ -366,7 +366,7 @@
           <w:sz w:val="22"/>
           <w:szCs w:val="22"/>
         </w:rPr>
-        <w:t xml:space="preserve">Technical Training — Software Engineering Immersive</w:t>
+        <w:t xml:space="preserve">Data Analytics Bootcamp (Part-Time)</w:t>
       </w:r>
       <w:r>
         <w:rPr>
@@ -383,6 +383,91 @@
           <w:sz w:val="20"/>
           <w:szCs w:val="20"/>
         </w:rPr>
+        <w:t xml:space="preserve">	10/2025 – 05/2026</w:t>
+      </w:r>
+    </w:p>
+    <w:p>
+      <w:pPr>
+        <w:pStyle w:val="ListParagraph"/>
+        <w:numPr>
+          <w:ilvl w:val="0"/>
+          <w:numId w:val="2"/>
+        </w:numPr>
+        <w:spacing w:after="40"/>
+      </w:pPr>
+      <w:r>
+        <w:rPr>
+          <w:sz w:val="21"/>
+          <w:szCs w:val="21"/>
+        </w:rPr>
+        <w:t xml:space="preserve">Completed a part-time Data Analytics program covering SQL, Excel, Python (pandas), and BI dashboarding (Power BI/Tableau).</w:t>
+      </w:r>
+    </w:p>
+    <w:p>
+      <w:pPr>
+        <w:pStyle w:val="ListParagraph"/>
+        <w:numPr>
+          <w:ilvl w:val="0"/>
+          <w:numId w:val="2"/>
+        </w:numPr>
+        <w:spacing w:after="40"/>
+      </w:pPr>
+      <w:r>
+        <w:rPr>
+          <w:sz w:val="21"/>
+          <w:szCs w:val="21"/>
+        </w:rPr>
+        <w:t xml:space="preserve">Built the four portfolio projects included in this CV (KPI dashboard, SQL sales analysis, pandas EDA, data quality checklist) as applied coursework.</w:t>
+      </w:r>
+    </w:p>
+    <w:p>
+      <w:pPr>
+        <w:pStyle w:val="ListParagraph"/>
+        <w:numPr>
+          <w:ilvl w:val="0"/>
+          <w:numId w:val="2"/>
+        </w:numPr>
+        <w:spacing w:after="40"/>
+      </w:pPr>
+      <w:r>
+        <w:rPr>
+          <w:sz w:val="21"/>
+          <w:szCs w:val="21"/>
+        </w:rPr>
+        <w:t xml:space="preserve">Practiced end-to-end analysis workflow: data cleaning, exploratory analysis, dashboard design, and insight write-up for a non-technical audience.</w:t>
+      </w:r>
+    </w:p>
+    <w:p>
+      <w:pPr>
+        <w:tabs>
+          <w:tab w:val="right" w:pos="9026"/>
+        </w:tabs>
+        <w:spacing w:after="40" w:before="160"/>
+      </w:pPr>
+      <w:r>
+        <w:rPr>
+          <w:b/>
+          <w:bCs/>
+          <w:sz w:val="22"/>
+          <w:szCs w:val="22"/>
+        </w:rPr>
+        <w:t xml:space="preserve">Technical Training — Software Engineering Immersive</w:t>
+      </w:r>
+      <w:r>
+        <w:rPr>
+          <w:sz w:val="22"/>
+          <w:szCs w:val="22"/>
+        </w:rPr>
+        <w:t xml:space="preserve">  |  General Assembly, Bahrain</w:t>
+      </w:r>
+      <w:r>
+        <w:rPr>
+          <w:i/>
+          <w:iCs/>
+          <w:color w:val="444444"/>
+          <w:sz w:val="20"/>
+          <w:szCs w:val="20"/>
+        </w:rPr>
         <w:t xml:space="preserve">	06/2023 – 09/2023</w:t>
       </w:r>
     </w:p>
@@ -731,6 +816,27 @@
           <w:szCs w:val="21"/>
         </w:rPr>
         <w:t xml:space="preserve"> — Arab Open University, Bahrain  |  01/2014 – 06/2017</w:t>
+      </w:r>
+    </w:p>
+    <w:p>
+      <w:pPr>
+        <w:spacing w:after="40"/>
+      </w:pPr>
+      <w:r>
+        <w:rPr>
+          <w:b/>
+          <w:bCs/>
+          <w:sz w:val="21"/>
+          <w:szCs w:val="21"/>
+        </w:rPr>
+        <w:t xml:space="preserve">Data Analytics Bootcamp (Part-Time)</w:t>
+      </w:r>
+      <w:r>
+        <w:rPr>
+          <w:sz w:val="21"/>
+          <w:szCs w:val="21"/>
+        </w:rPr>
+        <w:t xml:space="preserve"> — General Assembly, Bahrain  |  10/2025 – 05/2026</w:t>
       </w:r>
     </w:p>
     <w:p>

</xml_diff>

<commit_message>
Reorder CV: projects before experience for career-change positioning
</commit_message>
<xml_diff>
--- a/assets/Yusuf_Hakeem_Data_Analyst_CV_Bahrain.docx
+++ b/assets/Yusuf_Hakeem_Data_Analyst_CV_Bahrain.docx
@@ -230,6 +230,265 @@
           <w:sz w:val="22"/>
           <w:szCs w:val="22"/>
         </w:rPr>
+        <w:t xml:space="preserve">DATA ANALYTICS PROJECTS (PORTFOLIO — see github.com/ysa7799)</w:t>
+      </w:r>
+    </w:p>
+    <w:p>
+      <w:pPr>
+        <w:spacing w:after="20" w:before="100"/>
+      </w:pPr>
+      <w:r>
+        <w:rPr>
+          <w:b/>
+          <w:bCs/>
+          <w:sz w:val="21"/>
+          <w:szCs w:val="21"/>
+        </w:rPr>
+        <w:t xml:space="preserve">Operations KPI Dashboard — Excel / Power BI</w:t>
+      </w:r>
+    </w:p>
+    <w:p>
+      <w:pPr>
+        <w:pStyle w:val="ListParagraph"/>
+        <w:numPr>
+          <w:ilvl w:val="0"/>
+          <w:numId w:val="2"/>
+        </w:numPr>
+        <w:spacing w:after="40"/>
+      </w:pPr>
+      <w:r>
+        <w:rPr>
+          <w:sz w:val="21"/>
+          <w:szCs w:val="21"/>
+        </w:rPr>
+        <w:t xml:space="preserve">Cleaned and standardized an operations dataset; built a repeatable workflow for consistent monthly reporting.</w:t>
+      </w:r>
+    </w:p>
+    <w:p>
+      <w:pPr>
+        <w:pStyle w:val="ListParagraph"/>
+        <w:numPr>
+          <w:ilvl w:val="0"/>
+          <w:numId w:val="2"/>
+        </w:numPr>
+        <w:spacing w:after="40"/>
+      </w:pPr>
+      <w:r>
+        <w:rPr>
+          <w:sz w:val="21"/>
+          <w:szCs w:val="21"/>
+        </w:rPr>
+        <w:t xml:space="preserve">Created KPI views (incident volume, response time, category trends) using PivotTables and interactive visuals.</w:t>
+      </w:r>
+    </w:p>
+    <w:p>
+      <w:pPr>
+        <w:pStyle w:val="ListParagraph"/>
+        <w:numPr>
+          <w:ilvl w:val="0"/>
+          <w:numId w:val="2"/>
+        </w:numPr>
+        <w:spacing w:after="40"/>
+      </w:pPr>
+      <w:r>
+        <w:rPr>
+          <w:sz w:val="21"/>
+          <w:szCs w:val="21"/>
+        </w:rPr>
+        <w:t xml:space="preserve">Designed a clear dashboard layout and summarized insights with actionable recommendations.</w:t>
+      </w:r>
+    </w:p>
+    <w:p>
+      <w:pPr>
+        <w:spacing w:after="20" w:before="100"/>
+      </w:pPr>
+      <w:r>
+        <w:rPr>
+          <w:b/>
+          <w:bCs/>
+          <w:sz w:val="21"/>
+          <w:szCs w:val="21"/>
+        </w:rPr>
+        <w:t xml:space="preserve">Retail Sales Analysis — SQL</w:t>
+      </w:r>
+    </w:p>
+    <w:p>
+      <w:pPr>
+        <w:pStyle w:val="ListParagraph"/>
+        <w:numPr>
+          <w:ilvl w:val="0"/>
+          <w:numId w:val="2"/>
+        </w:numPr>
+        <w:spacing w:after="40"/>
+      </w:pPr>
+      <w:r>
+        <w:rPr>
+          <w:sz w:val="21"/>
+          <w:szCs w:val="21"/>
+        </w:rPr>
+        <w:t xml:space="preserve">Wrote SQL queries (joins, aggregations, CTEs) to answer business questions on sales performance and product mix.</w:t>
+      </w:r>
+    </w:p>
+    <w:p>
+      <w:pPr>
+        <w:pStyle w:val="ListParagraph"/>
+        <w:numPr>
+          <w:ilvl w:val="0"/>
+          <w:numId w:val="2"/>
+        </w:numPr>
+        <w:spacing w:after="40"/>
+      </w:pPr>
+      <w:r>
+        <w:rPr>
+          <w:sz w:val="21"/>
+          <w:szCs w:val="21"/>
+        </w:rPr>
+        <w:t xml:space="preserve">Built time-based comparisons and ranking outputs using window functions.</w:t>
+      </w:r>
+    </w:p>
+    <w:p>
+      <w:pPr>
+        <w:pStyle w:val="ListParagraph"/>
+        <w:numPr>
+          <w:ilvl w:val="0"/>
+          <w:numId w:val="2"/>
+        </w:numPr>
+        <w:spacing w:after="40"/>
+      </w:pPr>
+      <w:r>
+        <w:rPr>
+          <w:sz w:val="21"/>
+          <w:szCs w:val="21"/>
+        </w:rPr>
+        <w:t xml:space="preserve">Delivered concise insights on seasonality, top categories, and underperforming segments.</w:t>
+      </w:r>
+    </w:p>
+    <w:p>
+      <w:pPr>
+        <w:spacing w:after="20" w:before="100"/>
+      </w:pPr>
+      <w:r>
+        <w:rPr>
+          <w:b/>
+          <w:bCs/>
+          <w:sz w:val="21"/>
+          <w:szCs w:val="21"/>
+        </w:rPr>
+        <w:t xml:space="preserve">Customer Behavior Exploration — Python (pandas)</w:t>
+      </w:r>
+    </w:p>
+    <w:p>
+      <w:pPr>
+        <w:pStyle w:val="ListParagraph"/>
+        <w:numPr>
+          <w:ilvl w:val="0"/>
+          <w:numId w:val="2"/>
+        </w:numPr>
+        <w:spacing w:after="40"/>
+      </w:pPr>
+      <w:r>
+        <w:rPr>
+          <w:sz w:val="21"/>
+          <w:szCs w:val="21"/>
+        </w:rPr>
+        <w:t xml:space="preserve">Performed data cleaning, missing-value handling, and feature exploration using pandas.</w:t>
+      </w:r>
+    </w:p>
+    <w:p>
+      <w:pPr>
+        <w:pStyle w:val="ListParagraph"/>
+        <w:numPr>
+          <w:ilvl w:val="0"/>
+          <w:numId w:val="2"/>
+        </w:numPr>
+        <w:spacing w:after="40"/>
+      </w:pPr>
+      <w:r>
+        <w:rPr>
+          <w:sz w:val="21"/>
+          <w:szCs w:val="21"/>
+        </w:rPr>
+        <w:t xml:space="preserve">Visualized distributions and relationships to surface key drivers, anomalies, and outliers.</w:t>
+      </w:r>
+    </w:p>
+    <w:p>
+      <w:pPr>
+        <w:pStyle w:val="ListParagraph"/>
+        <w:numPr>
+          <w:ilvl w:val="0"/>
+          <w:numId w:val="2"/>
+        </w:numPr>
+        <w:spacing w:after="40"/>
+      </w:pPr>
+      <w:r>
+        <w:rPr>
+          <w:sz w:val="21"/>
+          <w:szCs w:val="21"/>
+        </w:rPr>
+        <w:t xml:space="preserve">Produced a short insight memo outlining findings and suggested next-step analyses.</w:t>
+      </w:r>
+    </w:p>
+    <w:p>
+      <w:pPr>
+        <w:spacing w:after="20" w:before="100"/>
+      </w:pPr>
+      <w:r>
+        <w:rPr>
+          <w:b/>
+          <w:bCs/>
+          <w:sz w:val="21"/>
+          <w:szCs w:val="21"/>
+        </w:rPr>
+        <w:t xml:space="preserve">Data Quality Checklist Template — Documentation</w:t>
+      </w:r>
+    </w:p>
+    <w:p>
+      <w:pPr>
+        <w:pStyle w:val="ListParagraph"/>
+        <w:numPr>
+          <w:ilvl w:val="0"/>
+          <w:numId w:val="2"/>
+        </w:numPr>
+        <w:spacing w:after="40"/>
+      </w:pPr>
+      <w:r>
+        <w:rPr>
+          <w:sz w:val="21"/>
+          <w:szCs w:val="21"/>
+        </w:rPr>
+        <w:t xml:space="preserve">Created a practical checklist for validating datasets (schema, duplicates, outliers, consistency).</w:t>
+      </w:r>
+    </w:p>
+    <w:p>
+      <w:pPr>
+        <w:pStyle w:val="ListParagraph"/>
+        <w:numPr>
+          <w:ilvl w:val="0"/>
+          <w:numId w:val="2"/>
+        </w:numPr>
+        <w:spacing w:after="40"/>
+      </w:pPr>
+      <w:r>
+        <w:rPr>
+          <w:sz w:val="21"/>
+          <w:szCs w:val="21"/>
+        </w:rPr>
+        <w:t xml:space="preserve">Added an issue-tracking format to document fixes and reduce recurring data errors.</w:t>
+      </w:r>
+    </w:p>
+    <w:p>
+      <w:pPr>
+        <w:pStyle w:val="Heading2"/>
+        <w:spacing w:after="60" w:before="240"/>
+      </w:pPr>
+      <w:r>
+        <w:rPr>
+          <w:b/>
+          <w:bCs/>
+          <w:color w:val="1F3864"/>
+          <w:sz w:val="22"/>
+          <w:szCs w:val="22"/>
+        </w:rPr>
         <w:t xml:space="preserve">EXPERIENCE</w:t>
       </w:r>
     </w:p>
@@ -247,14 +506,14 @@
           <w:sz w:val="22"/>
           <w:szCs w:val="22"/>
         </w:rPr>
-        <w:t xml:space="preserve">Security Operator</w:t>
+        <w:t xml:space="preserve">Data Analytics Bootcamp (Part-Time)</w:t>
       </w:r>
       <w:r>
         <w:rPr>
           <w:sz w:val="22"/>
           <w:szCs w:val="22"/>
         </w:rPr>
-        <w:t xml:space="preserve">  |  G4S, Bahrain</w:t>
+        <w:t xml:space="preserve">  |  General Assembly, Bahrain</w:t>
       </w:r>
       <w:r>
         <w:rPr>
@@ -264,92 +523,58 @@
           <w:sz w:val="20"/>
           <w:szCs w:val="20"/>
         </w:rPr>
-        <w:t xml:space="preserve">	01/2014 – Present</w:t>
-      </w:r>
-    </w:p>
-    <w:p>
-      <w:pPr>
-        <w:pStyle w:val="ListParagraph"/>
-        <w:numPr>
-          <w:ilvl w:val="0"/>
-          <w:numId w:val="2"/>
-        </w:numPr>
-        <w:spacing w:after="40"/>
-      </w:pPr>
-      <w:r>
-        <w:rPr>
-          <w:sz w:val="21"/>
-          <w:szCs w:val="21"/>
-        </w:rPr>
-        <w:t xml:space="preserve">Maintain structured incident and activity logs across 10+ years, ensuring accurate, auditable records used directly for operational review — equivalent to sustained data-integrity and documentation discipline.</w:t>
-      </w:r>
-    </w:p>
-    <w:p>
-      <w:pPr>
-        <w:pStyle w:val="ListParagraph"/>
-        <w:numPr>
-          <w:ilvl w:val="0"/>
-          <w:numId w:val="2"/>
-        </w:numPr>
-        <w:spacing w:after="40"/>
-      </w:pPr>
-      <w:r>
-        <w:rPr>
-          <w:sz w:val="21"/>
-          <w:szCs w:val="21"/>
-        </w:rPr>
-        <w:t xml:space="preserve">Prepare daily and shift summaries, consolidating raw observations into clear written reports for supervisors and stakeholders — the same synthesis skill required for KPI reporting.</w:t>
-      </w:r>
-    </w:p>
-    <w:p>
-      <w:pPr>
-        <w:pStyle w:val="ListParagraph"/>
-        <w:numPr>
-          <w:ilvl w:val="0"/>
-          <w:numId w:val="2"/>
-        </w:numPr>
-        <w:spacing w:after="40"/>
-      </w:pPr>
-      <w:r>
-        <w:rPr>
-          <w:sz w:val="21"/>
-          <w:szCs w:val="21"/>
-        </w:rPr>
-        <w:t xml:space="preserve">Track recurring incident frequency and patterns to flag operational improvement areas — direct analog to trend analysis and root-cause analysis in a BI context.</w:t>
-      </w:r>
-    </w:p>
-    <w:p>
-      <w:pPr>
-        <w:pStyle w:val="ListParagraph"/>
-        <w:numPr>
-          <w:ilvl w:val="0"/>
-          <w:numId w:val="2"/>
-        </w:numPr>
-        <w:spacing w:after="40"/>
-      </w:pPr>
-      <w:r>
-        <w:rPr>
-          <w:sz w:val="21"/>
-          <w:szCs w:val="21"/>
-        </w:rPr>
-        <w:t xml:space="preserve">Perform routine compliance checks, documenting results consistently to support audit readiness.</w:t>
-      </w:r>
-    </w:p>
-    <w:p>
-      <w:pPr>
-        <w:pStyle w:val="ListParagraph"/>
-        <w:numPr>
-          <w:ilvl w:val="0"/>
-          <w:numId w:val="2"/>
-        </w:numPr>
-        <w:spacing w:after="40"/>
-      </w:pPr>
-      <w:r>
-        <w:rPr>
-          <w:sz w:val="21"/>
-          <w:szCs w:val="21"/>
-        </w:rPr>
-        <w:t xml:space="preserve">Coordinate with cross-functional teams during incidents, ensuring timely response and complete documentation under pressure.</w:t>
+        <w:t xml:space="preserve">	10/2025 – 05/2026</w:t>
+      </w:r>
+    </w:p>
+    <w:p>
+      <w:pPr>
+        <w:pStyle w:val="ListParagraph"/>
+        <w:numPr>
+          <w:ilvl w:val="0"/>
+          <w:numId w:val="2"/>
+        </w:numPr>
+        <w:spacing w:after="40"/>
+      </w:pPr>
+      <w:r>
+        <w:rPr>
+          <w:sz w:val="21"/>
+          <w:szCs w:val="21"/>
+        </w:rPr>
+        <w:t xml:space="preserve">Completed a part-time Data Analytics program covering SQL, Excel, Python (pandas), and BI dashboarding (Power BI/Tableau).</w:t>
+      </w:r>
+    </w:p>
+    <w:p>
+      <w:pPr>
+        <w:pStyle w:val="ListParagraph"/>
+        <w:numPr>
+          <w:ilvl w:val="0"/>
+          <w:numId w:val="2"/>
+        </w:numPr>
+        <w:spacing w:after="40"/>
+      </w:pPr>
+      <w:r>
+        <w:rPr>
+          <w:sz w:val="21"/>
+          <w:szCs w:val="21"/>
+        </w:rPr>
+        <w:t xml:space="preserve">Built the four portfolio projects above (KPI dashboard, SQL sales analysis, pandas EDA, data quality checklist) as applied coursework.</w:t>
+      </w:r>
+    </w:p>
+    <w:p>
+      <w:pPr>
+        <w:pStyle w:val="ListParagraph"/>
+        <w:numPr>
+          <w:ilvl w:val="0"/>
+          <w:numId w:val="2"/>
+        </w:numPr>
+        <w:spacing w:after="40"/>
+      </w:pPr>
+      <w:r>
+        <w:rPr>
+          <w:sz w:val="21"/>
+          <w:szCs w:val="21"/>
+        </w:rPr>
+        <w:t xml:space="preserve">Practiced end-to-end analysis workflow: data cleaning, exploratory analysis, dashboard design, and insight write-up for a non-technical audience.</w:t>
       </w:r>
     </w:p>
     <w:p>
@@ -366,14 +591,14 @@
           <w:sz w:val="22"/>
           <w:szCs w:val="22"/>
         </w:rPr>
-        <w:t xml:space="preserve">Data Analytics Bootcamp (Part-Time)</w:t>
+        <w:t xml:space="preserve">Security Operator</w:t>
       </w:r>
       <w:r>
         <w:rPr>
           <w:sz w:val="22"/>
           <w:szCs w:val="22"/>
         </w:rPr>
-        <w:t xml:space="preserve">  |  General Assembly, Bahrain</w:t>
+        <w:t xml:space="preserve">  |  G4S, Bahrain</w:t>
       </w:r>
       <w:r>
         <w:rPr>
@@ -383,58 +608,92 @@
           <w:sz w:val="20"/>
           <w:szCs w:val="20"/>
         </w:rPr>
-        <w:t xml:space="preserve">	10/2025 – 05/2026</w:t>
-      </w:r>
-    </w:p>
-    <w:p>
-      <w:pPr>
-        <w:pStyle w:val="ListParagraph"/>
-        <w:numPr>
-          <w:ilvl w:val="0"/>
-          <w:numId w:val="2"/>
-        </w:numPr>
-        <w:spacing w:after="40"/>
-      </w:pPr>
-      <w:r>
-        <w:rPr>
-          <w:sz w:val="21"/>
-          <w:szCs w:val="21"/>
-        </w:rPr>
-        <w:t xml:space="preserve">Completed a part-time Data Analytics program covering SQL, Excel, Python (pandas), and BI dashboarding (Power BI/Tableau).</w:t>
-      </w:r>
-    </w:p>
-    <w:p>
-      <w:pPr>
-        <w:pStyle w:val="ListParagraph"/>
-        <w:numPr>
-          <w:ilvl w:val="0"/>
-          <w:numId w:val="2"/>
-        </w:numPr>
-        <w:spacing w:after="40"/>
-      </w:pPr>
-      <w:r>
-        <w:rPr>
-          <w:sz w:val="21"/>
-          <w:szCs w:val="21"/>
-        </w:rPr>
-        <w:t xml:space="preserve">Built the four portfolio projects included in this CV (KPI dashboard, SQL sales analysis, pandas EDA, data quality checklist) as applied coursework.</w:t>
-      </w:r>
-    </w:p>
-    <w:p>
-      <w:pPr>
-        <w:pStyle w:val="ListParagraph"/>
-        <w:numPr>
-          <w:ilvl w:val="0"/>
-          <w:numId w:val="2"/>
-        </w:numPr>
-        <w:spacing w:after="40"/>
-      </w:pPr>
-      <w:r>
-        <w:rPr>
-          <w:sz w:val="21"/>
-          <w:szCs w:val="21"/>
-        </w:rPr>
-        <w:t xml:space="preserve">Practiced end-to-end analysis workflow: data cleaning, exploratory analysis, dashboard design, and insight write-up for a non-technical audience.</w:t>
+        <w:t xml:space="preserve">	01/2014 – Present</w:t>
+      </w:r>
+    </w:p>
+    <w:p>
+      <w:pPr>
+        <w:pStyle w:val="ListParagraph"/>
+        <w:numPr>
+          <w:ilvl w:val="0"/>
+          <w:numId w:val="2"/>
+        </w:numPr>
+        <w:spacing w:after="40"/>
+      </w:pPr>
+      <w:r>
+        <w:rPr>
+          <w:sz w:val="21"/>
+          <w:szCs w:val="21"/>
+        </w:rPr>
+        <w:t xml:space="preserve">Maintain structured incident and activity logs across 10+ years, ensuring accurate, auditable records used directly for operational review — equivalent to sustained data-integrity and documentation discipline.</w:t>
+      </w:r>
+    </w:p>
+    <w:p>
+      <w:pPr>
+        <w:pStyle w:val="ListParagraph"/>
+        <w:numPr>
+          <w:ilvl w:val="0"/>
+          <w:numId w:val="2"/>
+        </w:numPr>
+        <w:spacing w:after="40"/>
+      </w:pPr>
+      <w:r>
+        <w:rPr>
+          <w:sz w:val="21"/>
+          <w:szCs w:val="21"/>
+        </w:rPr>
+        <w:t xml:space="preserve">Prepare daily and shift summaries, consolidating raw observations into clear written reports for supervisors and stakeholders — the same synthesis skill required for KPI reporting.</w:t>
+      </w:r>
+    </w:p>
+    <w:p>
+      <w:pPr>
+        <w:pStyle w:val="ListParagraph"/>
+        <w:numPr>
+          <w:ilvl w:val="0"/>
+          <w:numId w:val="2"/>
+        </w:numPr>
+        <w:spacing w:after="40"/>
+      </w:pPr>
+      <w:r>
+        <w:rPr>
+          <w:sz w:val="21"/>
+          <w:szCs w:val="21"/>
+        </w:rPr>
+        <w:t xml:space="preserve">Track recurring incident frequency and patterns to flag operational improvement areas — direct analog to trend analysis and root-cause analysis in a BI context.</w:t>
+      </w:r>
+    </w:p>
+    <w:p>
+      <w:pPr>
+        <w:pStyle w:val="ListParagraph"/>
+        <w:numPr>
+          <w:ilvl w:val="0"/>
+          <w:numId w:val="2"/>
+        </w:numPr>
+        <w:spacing w:after="40"/>
+      </w:pPr>
+      <w:r>
+        <w:rPr>
+          <w:sz w:val="21"/>
+          <w:szCs w:val="21"/>
+        </w:rPr>
+        <w:t xml:space="preserve">Perform routine compliance checks, documenting results consistently to support audit readiness.</w:t>
+      </w:r>
+    </w:p>
+    <w:p>
+      <w:pPr>
+        <w:pStyle w:val="ListParagraph"/>
+        <w:numPr>
+          <w:ilvl w:val="0"/>
+          <w:numId w:val="2"/>
+        </w:numPr>
+        <w:spacing w:after="40"/>
+      </w:pPr>
+      <w:r>
+        <w:rPr>
+          <w:sz w:val="21"/>
+          <w:szCs w:val="21"/>
+        </w:rPr>
+        <w:t xml:space="preserve">Coordinate with cross-functional teams during incidents, ensuring timely response and complete documentation under pressure.</w:t>
       </w:r>
     </w:p>
     <w:p>
@@ -520,265 +779,6 @@
           <w:szCs w:val="21"/>
         </w:rPr>
         <w:t xml:space="preserve">Strengthened analytical thinking, debugging, and disciplined documentation practices that transfer directly to analytics workflows.</w:t>
-      </w:r>
-    </w:p>
-    <w:p>
-      <w:pPr>
-        <w:pStyle w:val="Heading2"/>
-        <w:spacing w:after="60" w:before="240"/>
-      </w:pPr>
-      <w:r>
-        <w:rPr>
-          <w:b/>
-          <w:bCs/>
-          <w:color w:val="1F3864"/>
-          <w:sz w:val="22"/>
-          <w:szCs w:val="22"/>
-        </w:rPr>
-        <w:t xml:space="preserve">DATA ANALYTICS PROJECTS (PORTFOLIO — see github.com/ysa7799)</w:t>
-      </w:r>
-    </w:p>
-    <w:p>
-      <w:pPr>
-        <w:spacing w:after="20" w:before="100"/>
-      </w:pPr>
-      <w:r>
-        <w:rPr>
-          <w:b/>
-          <w:bCs/>
-          <w:sz w:val="21"/>
-          <w:szCs w:val="21"/>
-        </w:rPr>
-        <w:t xml:space="preserve">Operations KPI Dashboard — Excel / Power BI</w:t>
-      </w:r>
-    </w:p>
-    <w:p>
-      <w:pPr>
-        <w:pStyle w:val="ListParagraph"/>
-        <w:numPr>
-          <w:ilvl w:val="0"/>
-          <w:numId w:val="2"/>
-        </w:numPr>
-        <w:spacing w:after="40"/>
-      </w:pPr>
-      <w:r>
-        <w:rPr>
-          <w:sz w:val="21"/>
-          <w:szCs w:val="21"/>
-        </w:rPr>
-        <w:t xml:space="preserve">Cleaned and standardized an operations dataset; built a repeatable workflow for consistent monthly reporting.</w:t>
-      </w:r>
-    </w:p>
-    <w:p>
-      <w:pPr>
-        <w:pStyle w:val="ListParagraph"/>
-        <w:numPr>
-          <w:ilvl w:val="0"/>
-          <w:numId w:val="2"/>
-        </w:numPr>
-        <w:spacing w:after="40"/>
-      </w:pPr>
-      <w:r>
-        <w:rPr>
-          <w:sz w:val="21"/>
-          <w:szCs w:val="21"/>
-        </w:rPr>
-        <w:t xml:space="preserve">Created KPI views (incident volume, response time, category trends) using PivotTables and interactive visuals.</w:t>
-      </w:r>
-    </w:p>
-    <w:p>
-      <w:pPr>
-        <w:pStyle w:val="ListParagraph"/>
-        <w:numPr>
-          <w:ilvl w:val="0"/>
-          <w:numId w:val="2"/>
-        </w:numPr>
-        <w:spacing w:after="40"/>
-      </w:pPr>
-      <w:r>
-        <w:rPr>
-          <w:sz w:val="21"/>
-          <w:szCs w:val="21"/>
-        </w:rPr>
-        <w:t xml:space="preserve">Designed a clear dashboard layout and summarized insights with actionable recommendations.</w:t>
-      </w:r>
-    </w:p>
-    <w:p>
-      <w:pPr>
-        <w:spacing w:after="20" w:before="100"/>
-      </w:pPr>
-      <w:r>
-        <w:rPr>
-          <w:b/>
-          <w:bCs/>
-          <w:sz w:val="21"/>
-          <w:szCs w:val="21"/>
-        </w:rPr>
-        <w:t xml:space="preserve">Retail Sales Analysis — SQL</w:t>
-      </w:r>
-    </w:p>
-    <w:p>
-      <w:pPr>
-        <w:pStyle w:val="ListParagraph"/>
-        <w:numPr>
-          <w:ilvl w:val="0"/>
-          <w:numId w:val="2"/>
-        </w:numPr>
-        <w:spacing w:after="40"/>
-      </w:pPr>
-      <w:r>
-        <w:rPr>
-          <w:sz w:val="21"/>
-          <w:szCs w:val="21"/>
-        </w:rPr>
-        <w:t xml:space="preserve">Wrote SQL queries (joins, aggregations, CTEs) to answer business questions on sales performance and product mix.</w:t>
-      </w:r>
-    </w:p>
-    <w:p>
-      <w:pPr>
-        <w:pStyle w:val="ListParagraph"/>
-        <w:numPr>
-          <w:ilvl w:val="0"/>
-          <w:numId w:val="2"/>
-        </w:numPr>
-        <w:spacing w:after="40"/>
-      </w:pPr>
-      <w:r>
-        <w:rPr>
-          <w:sz w:val="21"/>
-          <w:szCs w:val="21"/>
-        </w:rPr>
-        <w:t xml:space="preserve">Built time-based comparisons and ranking outputs using window functions.</w:t>
-      </w:r>
-    </w:p>
-    <w:p>
-      <w:pPr>
-        <w:pStyle w:val="ListParagraph"/>
-        <w:numPr>
-          <w:ilvl w:val="0"/>
-          <w:numId w:val="2"/>
-        </w:numPr>
-        <w:spacing w:after="40"/>
-      </w:pPr>
-      <w:r>
-        <w:rPr>
-          <w:sz w:val="21"/>
-          <w:szCs w:val="21"/>
-        </w:rPr>
-        <w:t xml:space="preserve">Delivered concise insights on seasonality, top categories, and underperforming segments.</w:t>
-      </w:r>
-    </w:p>
-    <w:p>
-      <w:pPr>
-        <w:spacing w:after="20" w:before="100"/>
-      </w:pPr>
-      <w:r>
-        <w:rPr>
-          <w:b/>
-          <w:bCs/>
-          <w:sz w:val="21"/>
-          <w:szCs w:val="21"/>
-        </w:rPr>
-        <w:t xml:space="preserve">Customer Behavior Exploration — Python (pandas)</w:t>
-      </w:r>
-    </w:p>
-    <w:p>
-      <w:pPr>
-        <w:pStyle w:val="ListParagraph"/>
-        <w:numPr>
-          <w:ilvl w:val="0"/>
-          <w:numId w:val="2"/>
-        </w:numPr>
-        <w:spacing w:after="40"/>
-      </w:pPr>
-      <w:r>
-        <w:rPr>
-          <w:sz w:val="21"/>
-          <w:szCs w:val="21"/>
-        </w:rPr>
-        <w:t xml:space="preserve">Performed data cleaning, missing-value handling, and feature exploration using pandas.</w:t>
-      </w:r>
-    </w:p>
-    <w:p>
-      <w:pPr>
-        <w:pStyle w:val="ListParagraph"/>
-        <w:numPr>
-          <w:ilvl w:val="0"/>
-          <w:numId w:val="2"/>
-        </w:numPr>
-        <w:spacing w:after="40"/>
-      </w:pPr>
-      <w:r>
-        <w:rPr>
-          <w:sz w:val="21"/>
-          <w:szCs w:val="21"/>
-        </w:rPr>
-        <w:t xml:space="preserve">Visualized distributions and relationships to surface key drivers, anomalies, and outliers.</w:t>
-      </w:r>
-    </w:p>
-    <w:p>
-      <w:pPr>
-        <w:pStyle w:val="ListParagraph"/>
-        <w:numPr>
-          <w:ilvl w:val="0"/>
-          <w:numId w:val="2"/>
-        </w:numPr>
-        <w:spacing w:after="40"/>
-      </w:pPr>
-      <w:r>
-        <w:rPr>
-          <w:sz w:val="21"/>
-          <w:szCs w:val="21"/>
-        </w:rPr>
-        <w:t xml:space="preserve">Produced a short insight memo outlining findings and suggested next-step analyses.</w:t>
-      </w:r>
-    </w:p>
-    <w:p>
-      <w:pPr>
-        <w:spacing w:after="20" w:before="100"/>
-      </w:pPr>
-      <w:r>
-        <w:rPr>
-          <w:b/>
-          <w:bCs/>
-          <w:sz w:val="21"/>
-          <w:szCs w:val="21"/>
-        </w:rPr>
-        <w:t xml:space="preserve">Data Quality Checklist Template — Documentation</w:t>
-      </w:r>
-    </w:p>
-    <w:p>
-      <w:pPr>
-        <w:pStyle w:val="ListParagraph"/>
-        <w:numPr>
-          <w:ilvl w:val="0"/>
-          <w:numId w:val="2"/>
-        </w:numPr>
-        <w:spacing w:after="40"/>
-      </w:pPr>
-      <w:r>
-        <w:rPr>
-          <w:sz w:val="21"/>
-          <w:szCs w:val="21"/>
-        </w:rPr>
-        <w:t xml:space="preserve">Created a practical checklist for validating datasets (schema, duplicates, outliers, consistency).</w:t>
-      </w:r>
-    </w:p>
-    <w:p>
-      <w:pPr>
-        <w:pStyle w:val="ListParagraph"/>
-        <w:numPr>
-          <w:ilvl w:val="0"/>
-          <w:numId w:val="2"/>
-        </w:numPr>
-        <w:spacing w:after="40"/>
-      </w:pPr>
-      <w:r>
-        <w:rPr>
-          <w:sz w:val="21"/>
-          <w:szCs w:val="21"/>
-        </w:rPr>
-        <w:t xml:space="preserve">Added an issue-tracking format to document fixes and reduce recurring data errors.</w:t>
       </w:r>
     </w:p>
     <w:p>

</xml_diff>

<commit_message>
Add real GA capstone project: Bahrain Import Trade Analysis 2025 (324K transactions, 221 countries)
</commit_message>
<xml_diff>
--- a/assets/Yusuf_Hakeem_Data_Analyst_CV_Bahrain.docx
+++ b/assets/Yusuf_Hakeem_Data_Analyst_CV_Bahrain.docx
@@ -231,6 +231,88 @@
           <w:szCs w:val="22"/>
         </w:rPr>
         <w:t xml:space="preserve">DATA ANALYTICS PROJECTS (PORTFOLIO — see github.com/ysa7799)</w:t>
+      </w:r>
+    </w:p>
+    <w:p>
+      <w:pPr>
+        <w:spacing w:after="20" w:before="100"/>
+      </w:pPr>
+      <w:r>
+        <w:rPr>
+          <w:b/>
+          <w:bCs/>
+          <w:sz w:val="21"/>
+          <w:szCs w:val="21"/>
+        </w:rPr>
+        <w:t xml:space="preserve">Bahrain Import Trade Analysis (2025) — Capstone Project, General Assembly</w:t>
+      </w:r>
+    </w:p>
+    <w:p>
+      <w:pPr>
+        <w:pStyle w:val="ListParagraph"/>
+        <w:numPr>
+          <w:ilvl w:val="0"/>
+          <w:numId w:val="2"/>
+        </w:numPr>
+        <w:spacing w:after="40"/>
+      </w:pPr>
+      <w:r>
+        <w:rPr>
+          <w:sz w:val="21"/>
+          <w:szCs w:val="21"/>
+        </w:rPr>
+        <w:t xml:space="preserve">Analyzed Bahrain's full-year 2025 import economy: 324,818 transactions, $16.45B total value, 221 source countries, 6,335 commodity types (official data.gov.bh dataset).</w:t>
+      </w:r>
+    </w:p>
+    <w:p>
+      <w:pPr>
+        <w:pStyle w:val="ListParagraph"/>
+        <w:numPr>
+          <w:ilvl w:val="0"/>
+          <w:numId w:val="2"/>
+        </w:numPr>
+        <w:spacing w:after="40"/>
+      </w:pPr>
+      <w:r>
+        <w:rPr>
+          <w:sz w:val="21"/>
+          <w:szCs w:val="21"/>
+        </w:rPr>
+        <w:t xml:space="preserve">Identified 32.4% import concentration in top 3 trading partners (China, Australia, UAE) and 17.9% commodity concentration in aluminium oxide + iron ore — key supply-chain risk findings.</w:t>
+      </w:r>
+    </w:p>
+    <w:p>
+      <w:pPr>
+        <w:pStyle w:val="ListParagraph"/>
+        <w:numPr>
+          <w:ilvl w:val="0"/>
+          <w:numId w:val="2"/>
+        </w:numPr>
+        <w:spacing w:after="40"/>
+      </w:pPr>
+      <w:r>
+        <w:rPr>
+          <w:sz w:val="21"/>
+          <w:szCs w:val="21"/>
+        </w:rPr>
+        <w:t xml:space="preserve">Surfaced a +1,105% H1-to-H2 growth signal in solar panel imports, flagging an early clean-energy transition trend ahead of public commentary.</w:t>
+      </w:r>
+    </w:p>
+    <w:p>
+      <w:pPr>
+        <w:pStyle w:val="ListParagraph"/>
+        <w:numPr>
+          <w:ilvl w:val="0"/>
+          <w:numId w:val="2"/>
+        </w:numPr>
+        <w:spacing w:after="40"/>
+      </w:pPr>
+      <w:r>
+        <w:rPr>
+          <w:sz w:val="21"/>
+          <w:szCs w:val="21"/>
+        </w:rPr>
+        <w:t xml:space="preserve">Delivered 5 policy recommendations to Bahrain's Ministry of Industry, Commerce and Tourism, including supplier diversification and a proposed trade intelligence monitoring unit.</w:t>
       </w:r>
     </w:p>
     <w:p>

</xml_diff>